<commit_message>
Update Sarah's profile: confirmed female, full home gym with deliberate cable/bench exclusions
</commit_message>
<xml_diff>
--- a/clients/sarah/Sarah_2Day_Training_Plan.docx
+++ b/clients/sarah/Sarah_2Day_Training_Plan.docx
@@ -32,7 +32,7 @@
           <w:sz w:val="22"/>
           <w:szCs w:val="22"/>
         </w:rPr>
-        <w:t xml:space="preserve">FAST-PACED CIRCUIT STRENGTH FOUNDATION — DUMBBELL ≤20 LB, BAND &amp; BODYWEIGHT</w:t>
+        <w:t xml:space="preserve">FAST-PACED CIRCUIT STRENGTH FOUNDATION — FULL HOME GYM, DUMBBELL/KETTLEBELL ≤20 LB, BAND &amp; BODYWEIGHT</w:t>
       </w:r>
     </w:p>
     <w:p>
@@ -81,7 +81,7 @@
           <w:sz w:val="17"/>
           <w:szCs w:val="17"/>
         </w:rPr>
-        <w:t xml:space="preserve">Trainer: Nick  ·  2 Days/Week  ·  Dumbbell ≤20 lb · Resistance Band · Bodyweight  ·  No age/sex/Styku data on file</w:t>
+        <w:t xml:space="preserve">Trainer: Nick  ·  2 Days/Week · Female  ·  Full Home Gym — Dumbbell/Kettlebell ≤20 lb (Trainer Ceiling), Band, Step/Box  ·  No age/weight/Styku data on file</w:t>
       </w:r>
     </w:p>
     <w:p>
@@ -97,7 +97,7 @@
           <w:sz w:val="17"/>
           <w:szCs w:val="17"/>
         </w:rPr>
-        <w:t xml:space="preserve">Equipment Assumption — Please Confirm:  </w:t>
+        <w:t xml:space="preserve">Equipment — Full Home Gym, By Trainer Design:  </w:t>
       </w:r>
       <w:r>
         <w:rPr>
@@ -106,7 +106,7 @@
           <w:sz w:val="17"/>
           <w:szCs w:val="17"/>
         </w:rPr>
-        <w:t xml:space="preserve">This program is built around a genuinely light, constrained equipment set, per real-time programming feedback from Nick: dumbbells up to 20 lbs (a hard ceiling, not a soft guideline), a resistance band, bodyweight, and one sturdy elevated surface — a step, chair, or couch, not a bench, per Sarah’s preference — for the one exercise that genuinely needs elevation, DB Hip Thrust. No cable machine and no barbell appear anywhere in this program. If this equipment assumption is wrong, flag it to your coach right away so loads and exercise selection can be corrected before Sarah trains from this document.</w:t>
+        <w:t xml:space="preserve">Sarah has access to a full home gym — confirmed, not an assumption. This program deliberately draws on dumbbells and/or kettlebells up to 20 lbs (a hard ceiling set by Nick, not a limit of what equipment exists), a resistance band, bodyweight, a step/box, and the pull-up bar and squat rack as stable anchors for banded pulling work. Two pieces of equipment Sarah has access to are intentionally NOT used anywhere in this program — by Nick’s direct coaching choice, not because they’re unavailable: the cable machine, and the bench. These are deliberate decisions about what works best for Sarah right now, not workarounds for missing equipment — if that ever changes, flag it to your coach so the program can be adjusted.</w:t>
       </w:r>
     </w:p>
     <w:p>
@@ -131,7 +131,7 @@
           <w:sz w:val="17"/>
           <w:szCs w:val="17"/>
         </w:rPr>
-        <w:t xml:space="preserve">Every exercise here respects what you and Nick have worked out together: nothing over 20 lbs, no bench, a fast-paced/high-repetition circuit style with very little rest, and cautious range on hip-hinge and squat movements given your current lower back and hamstring mobility. Hip Thrust and Glute Bridge — not a traditional deadlift or RDL — carry the primary hip-strength role in this program for exactly that reason: they build real hip and glute strength without asking for the sustained flat-back hip hinge under load that’s currently a challenge for you. Squat depth is cued to wherever is genuinely comfortable for you, not a fixed target — quality over depth, always.</w:t>
+        <w:t xml:space="preserve">Every exercise here respects what you and Nick have worked out together: nothing over 20 lbs, no bench, no cable machine, a fast-paced/high-repetition circuit style with very little rest, and cautious range on hip-hinge and squat movements given your current lower back and hamstring mobility. Hip Thrust and Glute Bridge — not a traditional deadlift or RDL — carry the primary hip-strength role in this program for exactly that reason: they build real hip and glute strength without asking for the sustained flat-back hip hinge under load that’s currently a challenge for you. Squat depth is cued to wherever is genuinely comfortable for you, not a fixed target — quality over depth, always. A kettlebell is offered alongside the dumbbell on a few movements simply for variety — same weight ceiling, same exercise, your choice of which feels better in hand.</w:t>
       </w:r>
     </w:p>
     <w:p>
@@ -156,7 +156,7 @@
           <w:sz w:val="17"/>
           <w:szCs w:val="17"/>
         </w:rPr>
-        <w:t xml:space="preserve">No age, sex, weight, or Styku scan exists on file for Sarah at all — this is one level further than a client who simply falls outside a bracket (e.g. Jake Poyner, Vinz Feller): there is no demographic or clinical data of any kind to place her in a bracket to begin with. None of CLAUDE.md’s Evidence-Based Science Layer numeric thresholds (protein/creatine tiers, ALST sarcopenia cutoffs, VFA, BMI flags, LIFTMOR bone-loading candidacy, pelvic floor triggers) can be computed or applied here — not omitted by oversight, genuinely unattachable to nothing. Per CLAUDE.md’s Demographic Scope Rule, this program applies only the sex-neutral structural philosophy: the Isolated → Compound → Metabolic three-zone build and RIR-based autoregulated progressive overload, both stated in CLAUDE.md as genuinely demographic-neutral principles. `includeNutritionBlock: false`, and `client.weightKg`/`ageYears`/`alstIndex`/`isPostmenopausal` are all left unset rather than fabricated, so `proteinBar()`/`pelvicFloorCallout()` correctly never fire. Revisit this note the moment age, sex, weight, or a Styku scan is ever added to her intake record.</w:t>
+        <w:t xml:space="preserve">As of 8/18/2026, one demographic fact is confirmed on file: Sarah is female (`client.sex: 'female'`). That confirmation, on its own, does NOT unlock any of CLAUDE.md’s Evidence-Based Science Layer numeric thresholds — ALST sarcopenia cutoffs, protein/creatine tiering, VFA, BMI flags, LIFTMOR bone-loading candidacy, and pelvic floor triggers all also require age and/or weight/Styku scan data, none of which exists for her yet. She remains one level further out than a client who simply falls outside a bracket (e.g. Jake Poyner, Vinz Feller): there is still no demographic/clinical data of any kind beyond sex to place her in a bracket. Per CLAUDE.md’s Demographic Scope Rule, this program continues to apply only the sex-neutral structural philosophy: the Isolated → Compound → Metabolic three-zone build and RIR-based autoregulated progressive overload, both stated in CLAUDE.md as genuinely demographic-neutral principles. `includeNutritionBlock: false`, and `client.weightKg`/`ageYears`/`alstIndex`/`isPostmenopausal` are all left unset rather than fabricated, so `proteinBar()`/`pelvicFloorCallout()` correctly never fire. Revisit this note the moment age, weight, or a Styku scan is ever added to her intake record.</w:t>
       </w:r>
     </w:p>
     <w:p>
@@ -181,7 +181,7 @@
           <w:sz w:val="17"/>
           <w:szCs w:val="17"/>
         </w:rPr>
-        <w:t xml:space="preserve">The constraints and structure behind this build come from a voice note from Nick, one of Sarah’s trainers, who has been training her consistently for the past several sessions — relayed by Xolokan on 8/18/2026. This is real-time trainer/movement feedback, not a formal Styku scan or PAR-Q intake questionnaire; no age, sex, weight, height, or strength-testing numbers exist for her anywhere in this system as of this build. Per this system’s standing rule to read a client’s full existing record before any build: her only prior record was a two-line pre-repo legacy outline (a bench-press/cable-pull/squat+OHP-superset 2-day "Athletic Strength" program, no `clients/sarah/` folder, no build script, nothing in Drive) — that outline is explicitly SUPERSEDED, not merged, by this build, since most of its structure conflicts directly with Nick’s current constraints (bench, cable machine, heavier squat/press loading). Exactly one detail was carried forward, confirmed compatible with the new constraints and a real prior client preference rather than a fabrication: single-arm DB row programmed only in superset, never standalone — see Day A, Block B.</w:t>
+        <w:t xml:space="preserve">The constraints and structure behind this build come from a voice note from Nick, one of Sarah’s trainers, who has been training her consistently for the past several sessions — relayed by Xolokan on 8/18/2026. This is real-time trainer/movement feedback, not a formal Styku scan or PAR-Q intake questionnaire; no age, weight, height, or strength-testing numbers exist for her anywhere in this system as of this build. Per this system’s standing rule to read a client’s full existing record before any build: her only prior record was a two-line pre-repo legacy outline (a bench-press/cable-pull/squat+OHP-superset 2-day "Athletic Strength" program, no `clients/sarah/` folder, no build script, nothing in Drive) — that outline is explicitly SUPERSEDED, not merged, by this build, since most of its structure conflicts directly with Nick’s current constraints (bench, cable machine, heavier squat/press loading). Exactly one detail was carried forward, confirmed compatible with the new constraints and a real prior client preference rather than a fabrication: single-arm DB row programmed only in superset, never standalone — see Day A, Block B. Same-day revision, still 8/18/2026: Xolokan separately confirmed Sarah is female and has a full standard home gym (not the minimal placeholder set assumed at first build). Neither fact relaxes Nick’s constraints above — if anything, knowing equipment isn’t the limiting factor makes his exclusions (no cable machine, avoid bench, 20 lb ceiling, limited hip-hinge/squat ROM) read as more deliberate, not less relevant. A kettlebell was added as an equivalent-weight alternate implement on a few movements as a genuine, constraint-compatible variety improvement; kettlebell swings, barbell work, squat-rack-loaded work, and bench work were all considered and rejected as direct conflicts with her stated constraints — see the script header’s "REVISION 8/18/2026" note for the full evaluation.</w:t>
       </w:r>
     </w:p>
     <w:p>
@@ -323,7 +323,7 @@
                 <w:sz w:val="14"/>
                 <w:szCs w:val="14"/>
               </w:rPr>
-              <w:t xml:space="preserve">FAST-PACED CIRCUIT · HIGH REPETITION · DUMBBELL ≤20 LB &amp; BODYWEIGHT · 35–45 MIN</w:t>
+              <w:t xml:space="preserve">FAST-PACED CIRCUIT · HIGH REPETITION · DUMBBELL/KETTLEBELL ≤20 LB &amp; BODYWEIGHT · 35–45 MIN</w:t>
             </w:r>
           </w:p>
         </w:tc>
@@ -1437,7 +1437,7 @@
           <w:sz w:val="17"/>
           <w:szCs w:val="17"/>
         </w:rPr>
-        <w:t xml:space="preserve">Continuous circuit — 3-4 rounds, ~15-20s to move between exercises, ~60-90s rest after completing a full round before repeating. Squat to your own comfortable depth (typically just above parallel is completely normal) — quality over depth, never force further range than control allows. This is house philosophy, not a Sarah-specific accommodation: "Long where you move, tight where you hold" is how full range of motion is coached across this entire program, for every client. DB Hip Thrust uses the elevated surface (step/chair/couch) — the only exercise in this program that needs it. Standing Press and Single-Arm Row run as a superset — no rest between the two, straight from one into the other — carried forward from Sarah’s prior programming preference that single-arm row never stands alone.</w:t>
+        <w:t xml:space="preserve">Continuous circuit — 3-4 rounds, ~15-20s to move between exercises, ~60-90s rest after completing a full round before repeating. Squat to your own comfortable depth (typically just above parallel is completely normal) — quality over depth, never force further range than control allows. This is house philosophy, not a Sarah-specific accommodation: "Long where you move, tight where you hold" is how full range of motion is coached across this entire program, for every client. DB Hip Thrust uses the step/box — the only exercise in this program that needs an elevated surface. Standing Press and Single-Arm Row run as a superset — no rest between the two, straight from one into the other — carried forward from Sarah’s prior programming preference that single-arm row never stands alone.</w:t>
       </w:r>
     </w:p>
     <w:tbl>
@@ -1737,7 +1737,7 @@
                 <w:sz w:val="18"/>
                 <w:szCs w:val="18"/>
               </w:rPr>
-              <w:t xml:space="preserve">Goblet Squat (Light DB or Bodyweight)</w:t>
+              <w:t xml:space="preserve">Goblet Squat (Light DB/KB or Bodyweight)</w:t>
             </w:r>
           </w:p>
         </w:tc>
@@ -1836,7 +1836,7 @@
                 <w:sz w:val="15"/>
                 <w:szCs w:val="15"/>
               </w:rPr>
-              <w:t xml:space="preserve">Bodyweight or ≤20 lb DB</w:t>
+              <w:t xml:space="preserve">Bodyweight or ≤20 lb DB/KB</w:t>
             </w:r>
           </w:p>
         </w:tc>
@@ -1977,7 +1977,7 @@
                 <w:sz w:val="18"/>
                 <w:szCs w:val="18"/>
               </w:rPr>
-              <w:t xml:space="preserve">DB Hip Thrust (Elevated on Step/Chair/Couch)</w:t>
+              <w:t xml:space="preserve">DB Hip Thrust (Elevated on Step/Box)</w:t>
             </w:r>
           </w:p>
         </w:tc>
@@ -2172,7 +2172,7 @@
                 <w:sz w:val="17"/>
                 <w:szCs w:val="17"/>
               </w:rPr>
-              <w:t xml:space="preserve">Upper back on the elevated surface, drive through heels, full hip extension at the top.</w:t>
+              <w:t xml:space="preserve">Upper back on the step/box, drive through heels, full hip extension at the top.</w:t>
             </w:r>
             <w:r>
               <w:rPr>
@@ -3012,7 +3012,7 @@
                 <w:sz w:val="18"/>
                 <w:szCs w:val="18"/>
               </w:rPr>
-              <w:t xml:space="preserve">Suitcase Carry (Single-Side, DB)</w:t>
+              <w:t xml:space="preserve">Suitcase Carry (Single-Side, DB or KB)</w:t>
             </w:r>
           </w:p>
         </w:tc>
@@ -3665,7 +3665,7 @@
                 <w:sz w:val="17"/>
                 <w:szCs w:val="17"/>
               </w:rPr>
-              <w:t xml:space="preserve">Band anchored at chest height, elbows drive back, squeeze shoulder blades.</w:t>
+              <w:t xml:space="preserve">Band anchored to the squat rack at chest height, elbows drive back, squeeze shoulder blades.</w:t>
             </w:r>
           </w:p>
         </w:tc>
@@ -3936,7 +3936,7 @@
                 <w:sz w:val="14"/>
                 <w:szCs w:val="14"/>
               </w:rPr>
-              <w:t xml:space="preserve">FAST-PACED CIRCUIT · HIGH REPETITION · DUMBBELL ≤20 LB, BAND &amp; BODYWEIGHT · 35–45 MIN</w:t>
+              <w:t xml:space="preserve">FAST-PACED CIRCUIT · HIGH REPETITION · DUMBBELL/KETTLEBELL ≤20 LB, BAND &amp; BODYWEIGHT · 35–45 MIN</w:t>
             </w:r>
           </w:p>
         </w:tc>
@@ -5337,7 +5337,7 @@
                 <w:sz w:val="18"/>
                 <w:szCs w:val="18"/>
               </w:rPr>
-              <w:t xml:space="preserve">DB Hip Thrust (Elevated on Step/Chair/Couch)</w:t>
+              <w:t xml:space="preserve">DB Hip Thrust (Elevated on Step/Box)</w:t>
             </w:r>
           </w:p>
         </w:tc>
@@ -5532,7 +5532,7 @@
                 <w:sz w:val="17"/>
                 <w:szCs w:val="17"/>
               </w:rPr>
-              <w:t xml:space="preserve">Upper back on the elevated surface, drive through heels, full extension at top.</w:t>
+              <w:t xml:space="preserve">Upper back on the step/box, drive through heels, full extension at top.</w:t>
             </w:r>
             <w:r>
               <w:rPr>
@@ -5577,7 +5577,7 @@
                 <w:sz w:val="18"/>
                 <w:szCs w:val="18"/>
               </w:rPr>
-              <w:t xml:space="preserve">Goblet Squat (Light DB or Bodyweight)</w:t>
+              <w:t xml:space="preserve">Goblet Squat (Light DB/KB or Bodyweight)</w:t>
             </w:r>
           </w:p>
         </w:tc>
@@ -5676,7 +5676,7 @@
                 <w:sz w:val="15"/>
                 <w:szCs w:val="15"/>
               </w:rPr>
-              <w:t xml:space="preserve">Bodyweight or ≤20 lb DB</w:t>
+              <w:t xml:space="preserve">Bodyweight or ≤20 lb DB/KB</w:t>
             </w:r>
           </w:p>
         </w:tc>
@@ -6252,7 +6252,7 @@
                 <w:sz w:val="17"/>
                 <w:szCs w:val="17"/>
               </w:rPr>
-              <w:t xml:space="preserve">Band anchored overhead, pull elbows down and back, squeeze the lats.</w:t>
+              <w:t xml:space="preserve">Band anchored to the pull-up bar overhead, pull elbows down and back, squeeze the lats.</w:t>
             </w:r>
             <w:r>
               <w:rPr>
@@ -6312,7 +6312,7 @@
           <w:sz w:val="17"/>
           <w:szCs w:val="17"/>
         </w:rPr>
-        <w:t xml:space="preserve">Shorter closing circuit — 2-3 rounds, same fast pace and minimal rest as Block B. Step-ups reuse the same elevated surface as the hip thrust above — no new equipment needed. This is the day’s primary conditioning stimulus at 2 days/week.</w:t>
+        <w:t xml:space="preserve">Shorter closing circuit — 2-3 rounds, same fast pace and minimal rest as Block B. Step-ups reuse the same step/box as the hip thrust above — no new equipment needed. This is the day’s primary conditioning stimulus at 2 days/week.</w:t>
       </w:r>
     </w:p>
     <w:tbl>
@@ -6612,7 +6612,7 @@
                 <w:sz w:val="18"/>
                 <w:szCs w:val="18"/>
               </w:rPr>
-              <w:t xml:space="preserve">Farmer Carry (DB, Both Hands)</w:t>
+              <w:t xml:space="preserve">Farmer Carry (DB or KB, Both Hands)</w:t>
             </w:r>
           </w:p>
         </w:tc>
@@ -7070,7 +7070,7 @@
                 <w:sz w:val="18"/>
                 <w:szCs w:val="18"/>
               </w:rPr>
-              <w:t xml:space="preserve">Step-Ups (Bodyweight, Elevated Surface)</w:t>
+              <w:t xml:space="preserve">Step-Ups (Bodyweight, Step/Box)</w:t>
             </w:r>
           </w:p>
         </w:tc>
@@ -7265,7 +7265,7 @@
                 <w:sz w:val="17"/>
                 <w:szCs w:val="17"/>
               </w:rPr>
-              <w:t xml:space="preserve">Full foot on the surface, drive through the heel, step down with control.</w:t>
+              <w:t xml:space="preserve">Full foot on the step/box, drive through the heel, step down with control.</w:t>
             </w:r>
           </w:p>
         </w:tc>
@@ -7809,7 +7809,7 @@
                 <w:sz w:val="14"/>
                 <w:szCs w:val="14"/>
               </w:rPr>
-              <w:t xml:space="preserve">Confirm equipment assumption, squat depth, and hip-hinge tolerance before adding any load.</w:t>
+              <w:t xml:space="preserve">Confirm squat depth and hip-hinge tolerance before adding any load.</w:t>
             </w:r>
           </w:p>
         </w:tc>
@@ -8398,7 +8398,7 @@
           <w:sz w:val="17"/>
           <w:szCs w:val="17"/>
         </w:rPr>
-        <w:t xml:space="preserve">If lower back and hamstring mobility have genuinely improved by 8 weeks, revisit with Nick whether a slightly longer-range hip hinge becomes appropriate, or whether the current hip-thrust-led approach continues to be the better fit — either is a legitimate outcome, not a target to force. If several circuit exercises have hit the 20 lb equipment ceiling, that’s the moment to discuss access to heavier dumbbells or additional equipment.</w:t>
+        <w:t xml:space="preserve">If lower back and hamstring mobility have genuinely improved by 8 weeks, revisit with Nick whether a slightly longer-range hip hinge becomes appropriate, or whether the current hip-thrust-led approach continues to be the better fit — either is a legitimate outcome, not a target to force. If several circuit exercises have hit the 20 lb ceiling, that’s the moment to discuss with Nick whether the ceiling itself should move, since equipment access is not the limiting factor.</w:t>
       </w:r>
     </w:p>
     <w:p>
@@ -8676,7 +8676,7 @@
               <w:sz w:val="13"/>
               <w:szCs w:val="13"/>
             </w:rPr>
-            <w:t xml:space="preserve">ICONS INDEX  |  SARAH  |  Fast-Paced Circuit Strength Foundation — Dumbbell ≤20 lb, Band &amp; Bodyweight</w:t>
+            <w:t xml:space="preserve">ICONS INDEX  |  SARAH  |  Fast-Paced Circuit Strength Foundation — Full Home Gym, Dumbbell/Kettlebell ≤20 lb, Band &amp; Bodyweight</w:t>
           </w:r>
         </w:p>
       </w:tc>

</xml_diff>